<commit_message>
FEAT: add SAS production-track graphics and CbzP bridge xpts
</commit_message>
<xml_diff>
--- a/TROPIC_SAP_v3.0.docx
+++ b/TROPIC_SAP_v3.0.docx
@@ -1399,6 +1399,23 @@
           <w:szCs w:val="18"/>
         </w:rPr>
         <w:t xml:space="preserve">This SAP is authored independently for a secondary analysis of Project Data Sphere data. It does not represent Sanofi's original SAP. All definitions are derived from Protocol Amendment 5 and reconciled against the Lancet 2010 publication. Every discrepancy between protocol and paper is documented. Every v2.0 error found in forensic audit is labelled AUDIT FIX with error number.</w:t>
+      </w:r>
+    </w:p>
+    <w:p>
+      <w:r>
+        <w:rPr>
+          <w:b/>
+          <w:color w:val="A6192E"/>
+        </w:rPr>
+        <w:t>IMPLEMENTATION SCOPE &amp; DATA AVAILABILITY (portfolio re-analysis)</w:t>
+      </w:r>
+    </w:p>
+    <w:p>
+      <w:r>
+        <w:rPr>
+          <w:b w:val="0"/>
+        </w:rPr>
+        <w:t>This SAP specifies the full, intended two-arm analysis of the TROPIC trial. In the actual Project Data Sphere release, only the Mitoxantrone (MP) control arm (safety N=371) is available as real, de-identified patient data; the Cabazitaxel (CbzP) experimental arm was NOT released. In this portfolio implementation the CbzP arm is therefore SYNTHETIC — reconstructed by proportional-hazards time-scaling of the real MP arm plus fixed-seed sampling from the published Lancet 2010 marginal distributions (it is NOT the Guyot et al. 2012 KM-digitisation method). Consequently: (1) all MP-arm results are real and are independently double-programmed (SAS production vs R validation, reconciled cell-by-cell on the unique key); (2) every between-arm (CbzP vs MP) comparison in this implementation is illustrative and circular by construction — it exercises the analysis machinery but is NOT an inferential clinical finding and must not be read as a re-analysis of the trial's treatment effect. The endpoint definitions, populations, censoring rules, and multiplicity framework below remain the governing specification. Documented implementation conventions: efficacy models stratify on ECOGBL and MEASDISF (ECOG used at its recorded level rather than collapsed 0–1 vs 2); KM number-at-risk is tabulated at 3-month intervals; AE week-offset dates are realised at calendar-week precision. See ADRG §7 and ANALYSIS_REPORT.md for the reconstruction method and its disclosed limitations.</w:t>
       </w:r>
     </w:p>
     <w:p>

</xml_diff>